<commit_message>
Corrigindo bugs da emissão do documento
</commit_message>
<xml_diff>
--- a/docs/forms/ficha_de_acolhimento.docx
+++ b/docs/forms/ficha_de_acolhimento.docx
@@ -137,8 +137,6 @@
           <w:szCs w:val="28"/>
         </w:rPr>
       </w:pPr>
-      <w:bookmarkStart w:id="0" w:name="_GoBack"/>
-      <w:bookmarkEnd w:id="0"/>
     </w:p>
     <w:p>
       <w:pPr>
@@ -5157,7 +5155,25 @@
                 <w:bCs/>
                 <w:color w:val="000000"/>
               </w:rPr>
-              <w:tab/>
+              <w:t>{</w:t>
+            </w:r>
+            <w:r>
+              <w:t>matriculado_sim</w:t>
+            </w:r>
+            <w:r>
+              <w:rPr>
+                <w:b/>
+                <w:bCs/>
+                <w:color w:val="000000"/>
+              </w:rPr>
+              <w:t>}</w:t>
+            </w:r>
+            <w:r>
+              <w:rPr>
+                <w:b/>
+                <w:bCs/>
+                <w:color w:val="000000"/>
+              </w:rPr>
               <w:t>) SIM</w:t>
             </w:r>
             <w:r>
@@ -5175,7 +5191,25 @@
                 <w:bCs/>
                 <w:color w:val="000000"/>
               </w:rPr>
-              <w:tab/>
+              <w:t>{</w:t>
+            </w:r>
+            <w:r>
+              <w:t>matriculado_nao</w:t>
+            </w:r>
+            <w:r>
+              <w:rPr>
+                <w:b/>
+                <w:bCs/>
+                <w:color w:val="000000"/>
+              </w:rPr>
+              <w:t>}</w:t>
+            </w:r>
+            <w:r>
+              <w:rPr>
+                <w:b/>
+                <w:bCs/>
+                <w:color w:val="000000"/>
+              </w:rPr>
               <w:t>) NÃO.</w:t>
             </w:r>
           </w:p>
@@ -5430,8 +5464,53 @@
                 <w:bCs/>
                 <w:color w:val="000000"/>
               </w:rPr>
-              <w:tab/>
-              <w:t>) SIM (  ) NÃO</w:t>
+              <w:t>{</w:t>
+            </w:r>
+            <w:r>
+              <w:t>parou_escola_sim</w:t>
+            </w:r>
+            <w:r>
+              <w:rPr>
+                <w:b/>
+                <w:bCs/>
+                <w:color w:val="000000"/>
+              </w:rPr>
+              <w:t>}</w:t>
+            </w:r>
+            <w:r>
+              <w:rPr>
+                <w:b/>
+                <w:bCs/>
+                <w:color w:val="000000"/>
+              </w:rPr>
+              <w:t>) SIM (</w:t>
+            </w:r>
+            <w:r>
+              <w:rPr>
+                <w:b/>
+                <w:bCs/>
+                <w:color w:val="000000"/>
+              </w:rPr>
+              <w:t>{</w:t>
+            </w:r>
+            <w:r>
+              <w:t>parou_escola_nao</w:t>
+            </w:r>
+            <w:r>
+              <w:rPr>
+                <w:b/>
+                <w:bCs/>
+                <w:color w:val="000000"/>
+              </w:rPr>
+              <w:t>}</w:t>
+            </w:r>
+            <w:r>
+              <w:rPr>
+                <w:b/>
+                <w:bCs/>
+                <w:color w:val="000000"/>
+              </w:rPr>
+              <w:t>) NÃO</w:t>
             </w:r>
           </w:p>
         </w:tc>
@@ -5733,16 +5812,104 @@
                 <w:bCs/>
                 <w:color w:val="000000"/>
               </w:rPr>
-              <w:t>POSSUI PROBLEMA DE SAÚDE QUE REQUER ACOMPANHAMENTO? (</w:t>
-            </w:r>
-            <w:r>
-              <w:rPr>
-                <w:b/>
-                <w:bCs/>
-                <w:color w:val="000000"/>
-              </w:rPr>
-              <w:tab/>
-              <w:t>) SIM QUAL.</w:t>
+              <w:t>POSSUI PROBLEMA DE SAÚDE QUE REQUER ACOMPANHAMENTO?</w:t>
+            </w:r>
+          </w:p>
+          <w:p>
+            <w:pPr>
+              <w:pBdr>
+                <w:top w:val="nil"/>
+                <w:left w:val="nil"/>
+                <w:bottom w:val="nil"/>
+                <w:right w:val="nil"/>
+                <w:between w:val="nil"/>
+              </w:pBdr>
+              <w:tabs>
+                <w:tab w:val="left" w:pos="6732"/>
+              </w:tabs>
+              <w:ind w:left="108" w:right="174"/>
+              <w:rPr>
+                <w:b/>
+                <w:bCs/>
+                <w:color w:val="000000"/>
+              </w:rPr>
+            </w:pPr>
+            <w:r>
+              <w:rPr>
+                <w:b/>
+                <w:bCs/>
+                <w:color w:val="000000"/>
+              </w:rPr>
+              <w:t>(</w:t>
+            </w:r>
+            <w:r>
+              <w:rPr>
+                <w:b/>
+                <w:bCs/>
+                <w:color w:val="000000"/>
+              </w:rPr>
+              <w:t>{</w:t>
+            </w:r>
+            <w:r>
+              <w:t>problema_saude_sim</w:t>
+            </w:r>
+            <w:r>
+              <w:t>}</w:t>
+            </w:r>
+            <w:r>
+              <w:rPr>
+                <w:b/>
+                <w:bCs/>
+                <w:color w:val="000000"/>
+              </w:rPr>
+              <w:t xml:space="preserve">) SIM </w:t>
+            </w:r>
+          </w:p>
+          <w:p>
+            <w:pPr>
+              <w:pBdr>
+                <w:top w:val="nil"/>
+                <w:left w:val="nil"/>
+                <w:bottom w:val="nil"/>
+                <w:right w:val="nil"/>
+                <w:between w:val="nil"/>
+              </w:pBdr>
+              <w:tabs>
+                <w:tab w:val="left" w:pos="6732"/>
+              </w:tabs>
+              <w:ind w:left="108" w:right="174"/>
+              <w:rPr>
+                <w:b/>
+                <w:bCs/>
+                <w:color w:val="000000"/>
+              </w:rPr>
+            </w:pPr>
+            <w:r>
+              <w:rPr>
+                <w:b/>
+                <w:bCs/>
+                <w:color w:val="000000"/>
+              </w:rPr>
+              <w:t>QUAL.</w:t>
+            </w:r>
+            <w:r>
+              <w:rPr>
+                <w:b/>
+                <w:bCs/>
+                <w:color w:val="000000"/>
+              </w:rPr>
+              <w:t xml:space="preserve"> {</w:t>
+            </w:r>
+            <w:r>
+              <w:t>problema_saude_qual</w:t>
+            </w:r>
+            <w:r>
+              <w:rPr>
+                <w:b/>
+                <w:bCs/>
+                <w:color w:val="000000"/>
+              </w:rPr>
+              <w:t>}</w:t>
             </w:r>
           </w:p>
         </w:tc>
@@ -5762,26 +5929,28 @@
                 <w:right w:val="nil"/>
                 <w:between w:val="nil"/>
               </w:pBdr>
-              <w:rPr>
-                <w:b/>
-                <w:bCs/>
-                <w:color w:val="000000"/>
-              </w:rPr>
-            </w:pPr>
-          </w:p>
-          <w:p>
-            <w:pPr>
-              <w:pBdr>
-                <w:top w:val="nil"/>
-                <w:left w:val="nil"/>
-                <w:bottom w:val="nil"/>
-                <w:right w:val="nil"/>
-                <w:between w:val="nil"/>
-              </w:pBdr>
               <w:tabs>
                 <w:tab w:val="left" w:pos="539"/>
               </w:tabs>
-              <w:ind w:left="172"/>
+              <w:rPr>
+                <w:b/>
+                <w:bCs/>
+                <w:color w:val="000000"/>
+              </w:rPr>
+            </w:pPr>
+          </w:p>
+          <w:p>
+            <w:pPr>
+              <w:pBdr>
+                <w:top w:val="nil"/>
+                <w:left w:val="nil"/>
+                <w:bottom w:val="nil"/>
+                <w:right w:val="nil"/>
+                <w:between w:val="nil"/>
+              </w:pBdr>
+              <w:tabs>
+                <w:tab w:val="left" w:pos="539"/>
+              </w:tabs>
               <w:rPr>
                 <w:b/>
                 <w:bCs/>
@@ -5802,7 +5971,25 @@
                 <w:bCs/>
                 <w:color w:val="000000"/>
               </w:rPr>
-              <w:tab/>
+              <w:t>{</w:t>
+            </w:r>
+            <w:r>
+              <w:t>problema_saude_nao</w:t>
+            </w:r>
+            <w:r>
+              <w:rPr>
+                <w:b/>
+                <w:bCs/>
+                <w:color w:val="000000"/>
+              </w:rPr>
+              <w:t>}</w:t>
+            </w:r>
+            <w:r>
+              <w:rPr>
+                <w:b/>
+                <w:bCs/>
+                <w:color w:val="000000"/>
+              </w:rPr>
               <w:t>) NÃO.</w:t>
             </w:r>
           </w:p>
@@ -5874,7 +6061,25 @@
                 <w:bCs/>
                 <w:color w:val="000000"/>
               </w:rPr>
-              <w:tab/>
+              <w:t>{</w:t>
+            </w:r>
+            <w:r>
+              <w:t>atendimento_ubs</w:t>
+            </w:r>
+            <w:r>
+              <w:rPr>
+                <w:b/>
+                <w:bCs/>
+                <w:color w:val="000000"/>
+              </w:rPr>
+              <w:t>}</w:t>
+            </w:r>
+            <w:r>
+              <w:rPr>
+                <w:b/>
+                <w:bCs/>
+                <w:color w:val="000000"/>
+              </w:rPr>
               <w:t>) UBS</w:t>
             </w:r>
             <w:r>
@@ -5892,7 +6097,25 @@
                 <w:bCs/>
                 <w:color w:val="000000"/>
               </w:rPr>
-              <w:tab/>
+              <w:t>{</w:t>
+            </w:r>
+            <w:r>
+              <w:t>atendimento_caps</w:t>
+            </w:r>
+            <w:r>
+              <w:rPr>
+                <w:b/>
+                <w:bCs/>
+                <w:color w:val="000000"/>
+              </w:rPr>
+              <w:t>}</w:t>
+            </w:r>
+            <w:r>
+              <w:rPr>
+                <w:b/>
+                <w:bCs/>
+                <w:color w:val="000000"/>
+              </w:rPr>
               <w:t>) CAPS</w:t>
             </w:r>
             <w:r>
@@ -5910,7 +6133,25 @@
                 <w:bCs/>
                 <w:color w:val="000000"/>
               </w:rPr>
-              <w:tab/>
+              <w:t>{</w:t>
+            </w:r>
+            <w:r>
+              <w:t>atendimento_hospital</w:t>
+            </w:r>
+            <w:r>
+              <w:rPr>
+                <w:b/>
+                <w:bCs/>
+                <w:color w:val="000000"/>
+              </w:rPr>
+              <w:t>}</w:t>
+            </w:r>
+            <w:r>
+              <w:rPr>
+                <w:b/>
+                <w:bCs/>
+                <w:color w:val="000000"/>
+              </w:rPr>
               <w:t>) HOSPITAL GERAL</w:t>
             </w:r>
             <w:r>
@@ -5928,7 +6169,25 @@
                 <w:bCs/>
                 <w:color w:val="000000"/>
               </w:rPr>
-              <w:tab/>
+              <w:t>{</w:t>
+            </w:r>
+            <w:r>
+              <w:t>atendimento_ser</w:t>
+            </w:r>
+            <w:r>
+              <w:rPr>
+                <w:b/>
+                <w:bCs/>
+                <w:color w:val="000000"/>
+              </w:rPr>
+              <w:t>}</w:t>
+            </w:r>
+            <w:r>
+              <w:rPr>
+                <w:b/>
+                <w:bCs/>
+                <w:color w:val="000000"/>
+              </w:rPr>
               <w:t>) SER</w:t>
             </w:r>
           </w:p>
@@ -5989,7 +6248,25 @@
                 <w:bCs/>
                 <w:color w:val="000000"/>
               </w:rPr>
-              <w:tab/>
+              <w:t>{</w:t>
+            </w:r>
+            <w:r>
+              <w:t>atendimento_outros</w:t>
+            </w:r>
+            <w:r>
+              <w:rPr>
+                <w:b/>
+                <w:bCs/>
+                <w:color w:val="000000"/>
+              </w:rPr>
+              <w:t>}</w:t>
+            </w:r>
+            <w:r>
+              <w:rPr>
+                <w:b/>
+                <w:bCs/>
+                <w:color w:val="000000"/>
+              </w:rPr>
               <w:t>) OUTROS</w:t>
             </w:r>
           </w:p>
@@ -6073,7 +6350,25 @@
                 <w:bCs/>
                 <w:color w:val="000000"/>
               </w:rPr>
-              <w:tab/>
+              <w:t>{</w:t>
+            </w:r>
+            <w:r>
+              <w:t>restricao_alimentar_sim</w:t>
+            </w:r>
+            <w:r>
+              <w:rPr>
+                <w:b/>
+                <w:bCs/>
+                <w:color w:val="000000"/>
+              </w:rPr>
+              <w:t>}</w:t>
+            </w:r>
+            <w:r>
+              <w:rPr>
+                <w:b/>
+                <w:bCs/>
+                <w:color w:val="000000"/>
+              </w:rPr>
               <w:t>) SIM</w:t>
             </w:r>
             <w:r>
@@ -6091,7 +6386,25 @@
                 <w:bCs/>
                 <w:color w:val="000000"/>
               </w:rPr>
-              <w:tab/>
+              <w:t>{</w:t>
+            </w:r>
+            <w:r>
+              <w:t>restricao_alimentar_nao</w:t>
+            </w:r>
+            <w:r>
+              <w:rPr>
+                <w:b/>
+                <w:bCs/>
+                <w:color w:val="000000"/>
+              </w:rPr>
+              <w:t>}</w:t>
+            </w:r>
+            <w:r>
+              <w:rPr>
+                <w:b/>
+                <w:bCs/>
+                <w:color w:val="000000"/>
+              </w:rPr>
               <w:t>) NÃO</w:t>
             </w:r>
             <w:r>
@@ -6102,6 +6415,28 @@
               </w:rPr>
               <w:tab/>
               <w:t>QUAL?</w:t>
+            </w:r>
+            <w:r>
+              <w:rPr>
+                <w:b/>
+                <w:bCs/>
+                <w:color w:val="000000"/>
+              </w:rPr>
+              <w:t xml:space="preserve"> ({</w:t>
+            </w:r>
+            <w:r>
+              <w:t>restricao_alimentar_qual</w:t>
+            </w:r>
+            <w:r>
+              <w:t>}</w:t>
+            </w:r>
+            <w:r>
+              <w:rPr>
+                <w:b/>
+                <w:bCs/>
+                <w:color w:val="000000"/>
+              </w:rPr>
+              <w:t>)</w:t>
             </w:r>
           </w:p>
         </w:tc>
@@ -6177,15 +6512,64 @@
                 <w:bCs/>
                 <w:color w:val="000000"/>
               </w:rPr>
-              <w:t>POSSUI RESTRIÇÃO PARA PRATICAR ATIVIDADE FÍSICA? (</w:t>
-            </w:r>
-            <w:r>
-              <w:rPr>
-                <w:b/>
-                <w:bCs/>
-                <w:color w:val="000000"/>
-              </w:rPr>
-              <w:tab/>
+              <w:t xml:space="preserve">POSSUI RESTRIÇÃO PARA PRATICAR ATIVIDADE FÍSICA? </w:t>
+            </w:r>
+          </w:p>
+          <w:p>
+            <w:pPr>
+              <w:pBdr>
+                <w:top w:val="nil"/>
+                <w:left w:val="nil"/>
+                <w:bottom w:val="nil"/>
+                <w:right w:val="nil"/>
+                <w:between w:val="nil"/>
+              </w:pBdr>
+              <w:tabs>
+                <w:tab w:val="left" w:pos="5578"/>
+                <w:tab w:val="left" w:pos="6350"/>
+                <w:tab w:val="left" w:pos="6717"/>
+              </w:tabs>
+              <w:spacing w:line="249" w:lineRule="auto"/>
+              <w:ind w:left="108"/>
+              <w:rPr>
+                <w:b/>
+                <w:bCs/>
+                <w:color w:val="000000"/>
+              </w:rPr>
+            </w:pPr>
+            <w:r>
+              <w:rPr>
+                <w:b/>
+                <w:bCs/>
+                <w:color w:val="000000"/>
+              </w:rPr>
+              <w:t>(</w:t>
+            </w:r>
+            <w:r>
+              <w:rPr>
+                <w:b/>
+                <w:bCs/>
+                <w:color w:val="000000"/>
+              </w:rPr>
+              <w:t>{</w:t>
+            </w:r>
+            <w:r>
+              <w:t>restricao_fisica_sim</w:t>
+            </w:r>
+            <w:r>
+              <w:rPr>
+                <w:b/>
+                <w:bCs/>
+                <w:color w:val="000000"/>
+              </w:rPr>
+              <w:t>}</w:t>
+            </w:r>
+            <w:r>
+              <w:rPr>
+                <w:b/>
+                <w:bCs/>
+                <w:color w:val="000000"/>
+              </w:rPr>
               <w:t>) SIM</w:t>
             </w:r>
             <w:r>
@@ -6194,7 +6578,14 @@
                 <w:bCs/>
                 <w:color w:val="000000"/>
               </w:rPr>
-              <w:tab/>
+              <w:t xml:space="preserve"> </w:t>
+            </w:r>
+            <w:r>
+              <w:rPr>
+                <w:b/>
+                <w:bCs/>
+                <w:color w:val="000000"/>
+              </w:rPr>
               <w:t>(</w:t>
             </w:r>
             <w:r>
@@ -6203,7 +6594,25 @@
                 <w:bCs/>
                 <w:color w:val="000000"/>
               </w:rPr>
-              <w:tab/>
+              <w:t>{</w:t>
+            </w:r>
+            <w:r>
+              <w:t>restricao_fisica_nao</w:t>
+            </w:r>
+            <w:r>
+              <w:rPr>
+                <w:b/>
+                <w:bCs/>
+                <w:color w:val="000000"/>
+              </w:rPr>
+              <w:t>}</w:t>
+            </w:r>
+            <w:r>
+              <w:rPr>
+                <w:b/>
+                <w:bCs/>
+                <w:color w:val="000000"/>
+              </w:rPr>
               <w:t>) NÃO</w:t>
             </w:r>
           </w:p>
@@ -6271,6 +6680,25 @@
                 <w:color w:val="000000"/>
               </w:rPr>
               <w:t>QUAL?</w:t>
+            </w:r>
+            <w:r>
+              <w:rPr>
+                <w:b/>
+                <w:bCs/>
+                <w:color w:val="000000"/>
+              </w:rPr>
+              <w:t xml:space="preserve"> {</w:t>
+            </w:r>
+            <w:r>
+              <w:t>restricao_fisica_qual</w:t>
+            </w:r>
+            <w:r>
+              <w:rPr>
+                <w:b/>
+                <w:bCs/>
+                <w:color w:val="000000"/>
+              </w:rPr>
+              <w:t>}</w:t>
             </w:r>
           </w:p>
         </w:tc>
@@ -6339,7 +6767,61 @@
                 <w:bCs/>
                 <w:color w:val="000000"/>
               </w:rPr>
-              <w:t>TEM BRONQUITE? ( )SIM  ( )NÃO</w:t>
+              <w:t>TEM BRONQUITE? (</w:t>
+            </w:r>
+            <w:r>
+              <w:rPr>
+                <w:b/>
+                <w:bCs/>
+                <w:color w:val="000000"/>
+              </w:rPr>
+              <w:t>{</w:t>
+            </w:r>
+            <w:r>
+              <w:t>bronquite_sim</w:t>
+            </w:r>
+            <w:r>
+              <w:rPr>
+                <w:b/>
+                <w:bCs/>
+                <w:color w:val="000000"/>
+              </w:rPr>
+              <w:t>}</w:t>
+            </w:r>
+            <w:r>
+              <w:rPr>
+                <w:b/>
+                <w:bCs/>
+                <w:color w:val="000000"/>
+              </w:rPr>
+              <w:t>)SIM  (</w:t>
+            </w:r>
+            <w:r>
+              <w:rPr>
+                <w:b/>
+                <w:bCs/>
+                <w:color w:val="000000"/>
+              </w:rPr>
+              <w:t>{</w:t>
+            </w:r>
+            <w:r>
+              <w:t>bronquite_nao</w:t>
+            </w:r>
+            <w:r>
+              <w:rPr>
+                <w:b/>
+                <w:bCs/>
+                <w:color w:val="000000"/>
+              </w:rPr>
+              <w:t>}</w:t>
+            </w:r>
+            <w:r>
+              <w:rPr>
+                <w:b/>
+                <w:bCs/>
+                <w:color w:val="000000"/>
+              </w:rPr>
+              <w:t>)NÃO</w:t>
             </w:r>
           </w:p>
         </w:tc>
@@ -6408,7 +6890,61 @@
                 <w:bCs/>
                 <w:color w:val="000000"/>
               </w:rPr>
-              <w:t>FALTA DE AR? ( )SIM ( ) NÃO</w:t>
+              <w:t>FALTA DE AR? (</w:t>
+            </w:r>
+            <w:r>
+              <w:rPr>
+                <w:b/>
+                <w:bCs/>
+                <w:color w:val="000000"/>
+              </w:rPr>
+              <w:t>{</w:t>
+            </w:r>
+            <w:r>
+              <w:t>falta_ar_sim</w:t>
+            </w:r>
+            <w:r>
+              <w:rPr>
+                <w:b/>
+                <w:bCs/>
+                <w:color w:val="000000"/>
+              </w:rPr>
+              <w:t>}</w:t>
+            </w:r>
+            <w:r>
+              <w:rPr>
+                <w:b/>
+                <w:bCs/>
+                <w:color w:val="000000"/>
+              </w:rPr>
+              <w:t>)SIM (</w:t>
+            </w:r>
+            <w:r>
+              <w:rPr>
+                <w:b/>
+                <w:bCs/>
+                <w:color w:val="000000"/>
+              </w:rPr>
+              <w:t>{</w:t>
+            </w:r>
+            <w:r>
+              <w:t>falta_ar_nao</w:t>
+            </w:r>
+            <w:r>
+              <w:rPr>
+                <w:b/>
+                <w:bCs/>
+                <w:color w:val="000000"/>
+              </w:rPr>
+              <w:t>}</w:t>
+            </w:r>
+            <w:r>
+              <w:rPr>
+                <w:b/>
+                <w:bCs/>
+                <w:color w:val="000000"/>
+              </w:rPr>
+              <w:t>) NÃO</w:t>
             </w:r>
           </w:p>
         </w:tc>
@@ -6620,6 +7156,7 @@
         <w:rPr>
           <w:rFonts w:ascii="Times New Roman" w:eastAsia="Times New Roman" w:hAnsi="Times New Roman" w:cs="Times New Roman"/>
           <w:color w:val="000000"/>
+          <w:u w:val="single"/>
         </w:rPr>
         <w:sectPr>
           <w:pgSz w:w="11910" w:h="16840"/>
@@ -6709,7 +7246,25 @@
                 <w:bCs/>
                 <w:color w:val="000000"/>
               </w:rPr>
-              <w:tab/>
+              <w:t>{</w:t>
+            </w:r>
+            <w:r>
+              <w:t>odontologico_sim</w:t>
+            </w:r>
+            <w:r>
+              <w:rPr>
+                <w:b/>
+                <w:bCs/>
+                <w:color w:val="000000"/>
+              </w:rPr>
+              <w:t>}</w:t>
+            </w:r>
+            <w:r>
+              <w:rPr>
+                <w:b/>
+                <w:bCs/>
+                <w:color w:val="000000"/>
+              </w:rPr>
               <w:t>) SIM</w:t>
             </w:r>
             <w:r>
@@ -6727,7 +7282,25 @@
                 <w:bCs/>
                 <w:color w:val="000000"/>
               </w:rPr>
-              <w:tab/>
+              <w:t>{</w:t>
+            </w:r>
+            <w:r>
+              <w:t>odontologico_nao</w:t>
+            </w:r>
+            <w:r>
+              <w:rPr>
+                <w:b/>
+                <w:bCs/>
+                <w:color w:val="000000"/>
+              </w:rPr>
+              <w:t>}</w:t>
+            </w:r>
+            <w:r>
+              <w:rPr>
+                <w:b/>
+                <w:bCs/>
+                <w:color w:val="000000"/>
+              </w:rPr>
               <w:t>) NÃO</w:t>
             </w:r>
           </w:p>
@@ -6858,7 +7431,25 @@
                 <w:bCs/>
                 <w:color w:val="000000"/>
               </w:rPr>
-              <w:tab/>
+              <w:t>{</w:t>
+            </w:r>
+            <w:r>
+              <w:t>deficiencia_sim</w:t>
+            </w:r>
+            <w:r>
+              <w:rPr>
+                <w:b/>
+                <w:bCs/>
+                <w:color w:val="000000"/>
+              </w:rPr>
+              <w:t>}</w:t>
+            </w:r>
+            <w:r>
+              <w:rPr>
+                <w:b/>
+                <w:bCs/>
+                <w:color w:val="000000"/>
+              </w:rPr>
               <w:t>) SIM</w:t>
             </w:r>
             <w:r>
@@ -6876,7 +7467,25 @@
                 <w:bCs/>
                 <w:color w:val="000000"/>
               </w:rPr>
-              <w:tab/>
+              <w:t>{</w:t>
+            </w:r>
+            <w:r>
+              <w:t>deficiencia_nao</w:t>
+            </w:r>
+            <w:r>
+              <w:rPr>
+                <w:b/>
+                <w:bCs/>
+                <w:color w:val="000000"/>
+              </w:rPr>
+              <w:t>}</w:t>
+            </w:r>
+            <w:r>
+              <w:rPr>
+                <w:b/>
+                <w:bCs/>
+                <w:color w:val="000000"/>
+              </w:rPr>
               <w:t>) NÃO</w:t>
             </w:r>
             <w:r>
@@ -6887,6 +7496,25 @@
               </w:rPr>
               <w:tab/>
               <w:t>QUAL?</w:t>
+            </w:r>
+            <w:r>
+              <w:rPr>
+                <w:b/>
+                <w:bCs/>
+                <w:color w:val="000000"/>
+              </w:rPr>
+              <w:t xml:space="preserve"> {</w:t>
+            </w:r>
+            <w:r>
+              <w:t>deficiencia_qual</w:t>
+            </w:r>
+            <w:r>
+              <w:rPr>
+                <w:b/>
+                <w:bCs/>
+                <w:color w:val="000000"/>
+              </w:rPr>
+              <w:t>}</w:t>
             </w:r>
           </w:p>
         </w:tc>
@@ -6954,25 +7582,94 @@
                 <w:bCs/>
                 <w:color w:val="000000"/>
               </w:rPr>
+              <w:t>{</w:t>
+            </w:r>
+            <w:r>
+              <w:t>oftalmologico_sim</w:t>
+            </w:r>
+            <w:r>
+              <w:rPr>
+                <w:b/>
+                <w:bCs/>
+                <w:color w:val="000000"/>
+              </w:rPr>
+              <w:t>}</w:t>
+            </w:r>
+            <w:r>
+              <w:rPr>
+                <w:b/>
+                <w:bCs/>
+                <w:color w:val="000000"/>
+              </w:rPr>
+              <w:t>) SIM (</w:t>
+            </w:r>
+            <w:r>
+              <w:rPr>
+                <w:b/>
+                <w:bCs/>
+                <w:color w:val="000000"/>
+              </w:rPr>
+              <w:t>{</w:t>
+            </w:r>
+            <w:r>
+              <w:t>oftalmologico_nao</w:t>
+            </w:r>
+            <w:r>
+              <w:rPr>
+                <w:b/>
+                <w:bCs/>
+                <w:color w:val="000000"/>
+              </w:rPr>
+              <w:t>}</w:t>
+            </w:r>
+            <w:r>
+              <w:rPr>
+                <w:b/>
+                <w:bCs/>
+                <w:color w:val="000000"/>
+              </w:rPr>
+              <w:t>) NÃO</w:t>
+            </w:r>
+            <w:r>
+              <w:rPr>
+                <w:b/>
+                <w:bCs/>
+                <w:color w:val="000000"/>
+              </w:rPr>
               <w:tab/>
-              <w:t>) SIM (</w:t>
-            </w:r>
-            <w:r>
-              <w:rPr>
-                <w:b/>
-                <w:bCs/>
-                <w:color w:val="000000"/>
-              </w:rPr>
-              <w:tab/>
-              <w:t>) NÃO</w:t>
-            </w:r>
-            <w:r>
-              <w:rPr>
-                <w:b/>
-                <w:bCs/>
-                <w:color w:val="000000"/>
-              </w:rPr>
-              <w:tab/>
+            </w:r>
+          </w:p>
+          <w:p>
+            <w:pPr>
+              <w:pBdr>
+                <w:top w:val="nil"/>
+                <w:left w:val="nil"/>
+                <w:bottom w:val="nil"/>
+                <w:right w:val="nil"/>
+                <w:between w:val="nil"/>
+              </w:pBdr>
+              <w:tabs>
+                <w:tab w:val="left" w:pos="3957"/>
+                <w:tab w:val="left" w:pos="4797"/>
+                <w:tab w:val="left" w:pos="5740"/>
+                <w:tab w:val="left" w:pos="8100"/>
+                <w:tab w:val="left" w:pos="8921"/>
+                <w:tab w:val="left" w:pos="9288"/>
+              </w:tabs>
+              <w:spacing w:line="249" w:lineRule="auto"/>
+              <w:ind w:left="108"/>
+              <w:rPr>
+                <w:b/>
+                <w:bCs/>
+                <w:color w:val="000000"/>
+              </w:rPr>
+            </w:pPr>
+            <w:r>
+              <w:rPr>
+                <w:b/>
+                <w:bCs/>
+                <w:color w:val="000000"/>
+              </w:rPr>
               <w:t>USA ÓCULOS/LENTE? (</w:t>
             </w:r>
             <w:r>
@@ -6981,7 +7678,25 @@
                 <w:bCs/>
                 <w:color w:val="000000"/>
               </w:rPr>
-              <w:tab/>
+              <w:t>{</w:t>
+            </w:r>
+            <w:r>
+              <w:t>usa_oculos_sim</w:t>
+            </w:r>
+            <w:r>
+              <w:rPr>
+                <w:b/>
+                <w:bCs/>
+                <w:color w:val="000000"/>
+              </w:rPr>
+              <w:t>}</w:t>
+            </w:r>
+            <w:r>
+              <w:rPr>
+                <w:b/>
+                <w:bCs/>
+                <w:color w:val="000000"/>
+              </w:rPr>
               <w:t>) SIM</w:t>
             </w:r>
             <w:r>
@@ -6999,7 +7714,25 @@
                 <w:bCs/>
                 <w:color w:val="000000"/>
               </w:rPr>
-              <w:tab/>
+              <w:t>{</w:t>
+            </w:r>
+            <w:r>
+              <w:t>usa_oculos_nao</w:t>
+            </w:r>
+            <w:r>
+              <w:rPr>
+                <w:b/>
+                <w:bCs/>
+                <w:color w:val="000000"/>
+              </w:rPr>
+              <w:t>}</w:t>
+            </w:r>
+            <w:r>
+              <w:rPr>
+                <w:b/>
+                <w:bCs/>
+                <w:color w:val="000000"/>
+              </w:rPr>
               <w:t>) NÃO</w:t>
             </w:r>
           </w:p>
@@ -7162,7 +7895,25 @@
                 <w:bCs/>
                 <w:color w:val="000000"/>
               </w:rPr>
-              <w:tab/>
+              <w:t>{</w:t>
+            </w:r>
+            <w:r>
+              <w:t>fica_sozinho_sim</w:t>
+            </w:r>
+            <w:r>
+              <w:rPr>
+                <w:b/>
+                <w:bCs/>
+                <w:color w:val="000000"/>
+              </w:rPr>
+              <w:t>}</w:t>
+            </w:r>
+            <w:r>
+              <w:rPr>
+                <w:b/>
+                <w:bCs/>
+                <w:color w:val="000000"/>
+              </w:rPr>
               <w:t>) SIM</w:t>
             </w:r>
             <w:r>
@@ -7180,7 +7931,25 @@
                 <w:bCs/>
                 <w:color w:val="000000"/>
               </w:rPr>
-              <w:tab/>
+              <w:t>{</w:t>
+            </w:r>
+            <w:r>
+              <w:t>fica_sozinho_nao</w:t>
+            </w:r>
+            <w:r>
+              <w:rPr>
+                <w:b/>
+                <w:bCs/>
+                <w:color w:val="000000"/>
+              </w:rPr>
+              <w:t>}</w:t>
+            </w:r>
+            <w:r>
+              <w:rPr>
+                <w:b/>
+                <w:bCs/>
+                <w:color w:val="000000"/>
+              </w:rPr>
               <w:t>) NÃO</w:t>
             </w:r>
           </w:p>
@@ -7306,7 +8075,25 @@
                 <w:bCs/>
                 <w:color w:val="000000"/>
               </w:rPr>
-              <w:tab/>
+              <w:t>{</w:t>
+            </w:r>
+            <w:r>
+              <w:t>interage_nunca</w:t>
+            </w:r>
+            <w:r>
+              <w:rPr>
+                <w:b/>
+                <w:bCs/>
+                <w:color w:val="000000"/>
+              </w:rPr>
+              <w:t>}</w:t>
+            </w:r>
+            <w:r>
+              <w:rPr>
+                <w:b/>
+                <w:bCs/>
+                <w:color w:val="000000"/>
+              </w:rPr>
               <w:t>) NUNCA (</w:t>
             </w:r>
             <w:r>
@@ -7315,7 +8102,25 @@
                 <w:bCs/>
                 <w:color w:val="000000"/>
               </w:rPr>
-              <w:tab/>
+              <w:t>{</w:t>
+            </w:r>
+            <w:r>
+              <w:t>interage_raramente</w:t>
+            </w:r>
+            <w:r>
+              <w:rPr>
+                <w:b/>
+                <w:bCs/>
+                <w:color w:val="000000"/>
+              </w:rPr>
+              <w:t>}</w:t>
+            </w:r>
+            <w:r>
+              <w:rPr>
+                <w:b/>
+                <w:bCs/>
+                <w:color w:val="000000"/>
+              </w:rPr>
               <w:t>) RARAMENTE</w:t>
             </w:r>
             <w:r>
@@ -7333,7 +8138,25 @@
                 <w:bCs/>
                 <w:color w:val="000000"/>
               </w:rPr>
-              <w:tab/>
+              <w:t>{</w:t>
+            </w:r>
+            <w:r>
+              <w:t>interage_sempre</w:t>
+            </w:r>
+            <w:r>
+              <w:rPr>
+                <w:b/>
+                <w:bCs/>
+                <w:color w:val="000000"/>
+              </w:rPr>
+              <w:t>}</w:t>
+            </w:r>
+            <w:r>
+              <w:rPr>
+                <w:b/>
+                <w:bCs/>
+                <w:color w:val="000000"/>
+              </w:rPr>
               <w:t>) SEMPRE</w:t>
             </w:r>
           </w:p>
@@ -7400,7 +8223,25 @@
                 <w:bCs/>
                 <w:color w:val="000000"/>
               </w:rPr>
-              <w:tab/>
+              <w:t>{</w:t>
+            </w:r>
+            <w:r>
+              <w:t>interage_familia</w:t>
+            </w:r>
+            <w:r>
+              <w:rPr>
+                <w:b/>
+                <w:bCs/>
+                <w:color w:val="000000"/>
+              </w:rPr>
+              <w:t>}</w:t>
+            </w:r>
+            <w:r>
+              <w:rPr>
+                <w:b/>
+                <w:bCs/>
+                <w:color w:val="000000"/>
+              </w:rPr>
               <w:t xml:space="preserve">) </w:t>
             </w:r>
             <w:r>
@@ -7416,7 +8257,14 @@
                 <w:bCs/>
                 <w:color w:val="000000"/>
               </w:rPr>
-              <w:tab/>
+              <w:t xml:space="preserve">     </w:t>
+            </w:r>
+            <w:r>
+              <w:rPr>
+                <w:b/>
+                <w:bCs/>
+                <w:color w:val="000000"/>
+              </w:rPr>
               <w:t>(</w:t>
             </w:r>
             <w:r>
@@ -7425,16 +8273,68 @@
                 <w:bCs/>
                 <w:color w:val="000000"/>
               </w:rPr>
-              <w:tab/>
-              <w:t>) AMIGOS (</w:t>
-            </w:r>
-            <w:r>
-              <w:rPr>
-                <w:b/>
-                <w:bCs/>
-                <w:color w:val="000000"/>
-              </w:rPr>
-              <w:tab/>
+              <w:t>{</w:t>
+            </w:r>
+            <w:r>
+              <w:t>interage_amigos</w:t>
+            </w:r>
+            <w:r>
+              <w:rPr>
+                <w:b/>
+                <w:bCs/>
+                <w:color w:val="000000"/>
+              </w:rPr>
+              <w:t>}</w:t>
+            </w:r>
+            <w:r>
+              <w:rPr>
+                <w:b/>
+                <w:bCs/>
+                <w:color w:val="000000"/>
+              </w:rPr>
+              <w:t xml:space="preserve">) AMIGOS </w:t>
+            </w:r>
+            <w:r>
+              <w:rPr>
+                <w:b/>
+                <w:bCs/>
+                <w:color w:val="000000"/>
+              </w:rPr>
+              <w:t xml:space="preserve">   </w:t>
+            </w:r>
+            <w:r>
+              <w:rPr>
+                <w:b/>
+                <w:bCs/>
+                <w:color w:val="000000"/>
+              </w:rPr>
+              <w:t>(</w:t>
+            </w:r>
+            <w:r>
+              <w:rPr>
+                <w:b/>
+                <w:bCs/>
+                <w:color w:val="000000"/>
+              </w:rPr>
+              <w:t>{</w:t>
+            </w:r>
+            <w:r>
+              <w:t>interage_parentes</w:t>
+            </w:r>
+            <w:r>
+              <w:rPr>
+                <w:b/>
+                <w:bCs/>
+                <w:color w:val="000000"/>
+              </w:rPr>
+              <w:t>}</w:t>
+            </w:r>
+            <w:r>
+              <w:rPr>
+                <w:b/>
+                <w:bCs/>
+                <w:color w:val="000000"/>
+              </w:rPr>
               <w:t>) PARENTES</w:t>
             </w:r>
           </w:p>
@@ -7505,7 +8405,25 @@
                 <w:bCs/>
                 <w:color w:val="000000"/>
               </w:rPr>
-              <w:tab/>
+              <w:t>{</w:t>
+            </w:r>
+            <w:r>
+              <w:t>onde_casa</w:t>
+            </w:r>
+            <w:r>
+              <w:rPr>
+                <w:b/>
+                <w:bCs/>
+                <w:color w:val="000000"/>
+              </w:rPr>
+              <w:t>}</w:t>
+            </w:r>
+            <w:r>
+              <w:rPr>
+                <w:b/>
+                <w:bCs/>
+                <w:color w:val="000000"/>
+              </w:rPr>
               <w:t>) EM CASA (</w:t>
             </w:r>
             <w:r>
@@ -7514,15 +8432,25 @@
                 <w:bCs/>
                 <w:color w:val="000000"/>
               </w:rPr>
-              <w:tab/>
-            </w:r>
-            <w:r>
-              <w:rPr>
-                <w:b/>
-                <w:bCs/>
-                <w:color w:val="000000"/>
-              </w:rPr>
-              <w:tab/>
+              <w:t>{</w:t>
+            </w:r>
+            <w:r>
+              <w:t>onde_parentes</w:t>
+            </w:r>
+            <w:r>
+              <w:rPr>
+                <w:b/>
+                <w:bCs/>
+                <w:color w:val="000000"/>
+              </w:rPr>
+              <w:t>}</w:t>
+            </w:r>
+            <w:r>
+              <w:rPr>
+                <w:b/>
+                <w:bCs/>
+                <w:color w:val="000000"/>
+              </w:rPr>
               <w:t>) CASA DE PARENTES/AMIGOS (</w:t>
             </w:r>
             <w:r>
@@ -7531,24 +8459,88 @@
                 <w:bCs/>
                 <w:color w:val="000000"/>
               </w:rPr>
-              <w:tab/>
-            </w:r>
-            <w:r>
-              <w:rPr>
-                <w:b/>
-                <w:bCs/>
-                <w:color w:val="000000"/>
-              </w:rPr>
-              <w:tab/>
-              <w:t>) RUA DO BAIRRO (</w:t>
-            </w:r>
-            <w:r>
-              <w:rPr>
-                <w:b/>
-                <w:bCs/>
-                <w:color w:val="000000"/>
-              </w:rPr>
-              <w:tab/>
+              <w:t>{</w:t>
+            </w:r>
+            <w:r>
+              <w:t>onde_rua</w:t>
+            </w:r>
+            <w:r>
+              <w:rPr>
+                <w:b/>
+                <w:bCs/>
+                <w:color w:val="000000"/>
+              </w:rPr>
+              <w:t>}</w:t>
+            </w:r>
+            <w:r>
+              <w:rPr>
+                <w:b/>
+                <w:bCs/>
+                <w:color w:val="000000"/>
+              </w:rPr>
+              <w:t xml:space="preserve">) RUA DO BAIRRO </w:t>
+            </w:r>
+          </w:p>
+          <w:p>
+            <w:pPr>
+              <w:pBdr>
+                <w:top w:val="nil"/>
+                <w:left w:val="nil"/>
+                <w:bottom w:val="nil"/>
+                <w:right w:val="nil"/>
+                <w:between w:val="nil"/>
+              </w:pBdr>
+              <w:tabs>
+                <w:tab w:val="left" w:pos="474"/>
+                <w:tab w:val="left" w:pos="1133"/>
+                <w:tab w:val="left" w:pos="2364"/>
+                <w:tab w:val="left" w:pos="2426"/>
+                <w:tab w:val="left" w:pos="3749"/>
+                <w:tab w:val="left" w:pos="4166"/>
+                <w:tab w:val="left" w:pos="5360"/>
+                <w:tab w:val="left" w:pos="5537"/>
+                <w:tab w:val="left" w:pos="7600"/>
+              </w:tabs>
+              <w:ind w:left="108" w:right="95"/>
+              <w:rPr>
+                <w:b/>
+                <w:bCs/>
+                <w:color w:val="000000"/>
+              </w:rPr>
+            </w:pPr>
+            <w:r>
+              <w:rPr>
+                <w:b/>
+                <w:bCs/>
+                <w:color w:val="000000"/>
+              </w:rPr>
+              <w:t>(</w:t>
+            </w:r>
+            <w:r>
+              <w:rPr>
+                <w:b/>
+                <w:bCs/>
+                <w:color w:val="000000"/>
+              </w:rPr>
+              <w:t>{</w:t>
+            </w:r>
+            <w:r>
+              <w:t>onde_pracas</w:t>
+            </w:r>
+            <w:r>
+              <w:rPr>
+                <w:b/>
+                <w:bCs/>
+                <w:color w:val="000000"/>
+              </w:rPr>
+              <w:t>}</w:t>
+            </w:r>
+            <w:r>
+              <w:rPr>
+                <w:b/>
+                <w:bCs/>
+                <w:color w:val="000000"/>
+              </w:rPr>
               <w:t>) QUADRAS/PRAÇAS/PARQUINHOS (</w:t>
             </w:r>
             <w:r>
@@ -7557,7 +8549,25 @@
                 <w:bCs/>
                 <w:color w:val="000000"/>
               </w:rPr>
-              <w:tab/>
+              <w:t>{</w:t>
+            </w:r>
+            <w:r>
+              <w:t>onde_redes</w:t>
+            </w:r>
+            <w:r>
+              <w:rPr>
+                <w:b/>
+                <w:bCs/>
+                <w:color w:val="000000"/>
+              </w:rPr>
+              <w:t>}</w:t>
+            </w:r>
+            <w:r>
+              <w:rPr>
+                <w:b/>
+                <w:bCs/>
+                <w:color w:val="000000"/>
+              </w:rPr>
               <w:t>) REDES SOCIAIS (</w:t>
             </w:r>
             <w:r>
@@ -7566,7 +8576,25 @@
                 <w:bCs/>
                 <w:color w:val="000000"/>
               </w:rPr>
-              <w:tab/>
+              <w:t>{</w:t>
+            </w:r>
+            <w:r>
+              <w:t>onde_telefone</w:t>
+            </w:r>
+            <w:r>
+              <w:rPr>
+                <w:b/>
+                <w:bCs/>
+                <w:color w:val="000000"/>
+              </w:rPr>
+              <w:t>}</w:t>
+            </w:r>
+            <w:r>
+              <w:rPr>
+                <w:b/>
+                <w:bCs/>
+                <w:color w:val="000000"/>
+              </w:rPr>
               <w:t>) TELEFONE</w:t>
             </w:r>
             <w:r>
@@ -7584,7 +8612,25 @@
                 <w:bCs/>
                 <w:color w:val="000000"/>
               </w:rPr>
-              <w:tab/>
+              <w:t>{</w:t>
+            </w:r>
+            <w:r>
+              <w:t>onde_festas</w:t>
+            </w:r>
+            <w:r>
+              <w:rPr>
+                <w:b/>
+                <w:bCs/>
+                <w:color w:val="000000"/>
+              </w:rPr>
+              <w:t>}</w:t>
+            </w:r>
+            <w:r>
+              <w:rPr>
+                <w:b/>
+                <w:bCs/>
+                <w:color w:val="000000"/>
+              </w:rPr>
               <w:t>) FESTAS (</w:t>
             </w:r>
             <w:r>
@@ -7593,7 +8639,25 @@
                 <w:bCs/>
                 <w:color w:val="000000"/>
               </w:rPr>
-              <w:tab/>
+              <w:t>{</w:t>
+            </w:r>
+            <w:r>
+              <w:t>onde_religioso</w:t>
+            </w:r>
+            <w:r>
+              <w:rPr>
+                <w:b/>
+                <w:bCs/>
+                <w:color w:val="000000"/>
+              </w:rPr>
+              <w:t>}</w:t>
+            </w:r>
+            <w:r>
+              <w:rPr>
+                <w:b/>
+                <w:bCs/>
+                <w:color w:val="000000"/>
+              </w:rPr>
               <w:t>) ENCONTROS RELIGIOSOS</w:t>
             </w:r>
           </w:p>
@@ -7633,7 +8697,25 @@
                 <w:bCs/>
                 <w:color w:val="000000"/>
               </w:rPr>
-              <w:tab/>
+              <w:t>{</w:t>
+            </w:r>
+            <w:r>
+              <w:t>onde_passeios</w:t>
+            </w:r>
+            <w:r>
+              <w:rPr>
+                <w:b/>
+                <w:bCs/>
+                <w:color w:val="000000"/>
+              </w:rPr>
+              <w:t>}</w:t>
+            </w:r>
+            <w:r>
+              <w:rPr>
+                <w:b/>
+                <w:bCs/>
+                <w:color w:val="000000"/>
+              </w:rPr>
               <w:t>) PASSEIOS</w:t>
             </w:r>
             <w:r>
@@ -7651,7 +8733,25 @@
                 <w:bCs/>
                 <w:color w:val="000000"/>
               </w:rPr>
-              <w:tab/>
+              <w:t>{</w:t>
+            </w:r>
+            <w:r>
+              <w:t>onde_outros</w:t>
+            </w:r>
+            <w:r>
+              <w:rPr>
+                <w:b/>
+                <w:bCs/>
+                <w:color w:val="000000"/>
+              </w:rPr>
+              <w:t>}</w:t>
+            </w:r>
+            <w:r>
+              <w:rPr>
+                <w:b/>
+                <w:bCs/>
+                <w:color w:val="000000"/>
+              </w:rPr>
               <w:t>) OUTROS. ESPECIFICAR</w:t>
             </w:r>
           </w:p>
@@ -7717,7 +8817,25 @@
                 <w:bCs/>
                 <w:color w:val="000000"/>
               </w:rPr>
-              <w:tab/>
+              <w:t>{</w:t>
+            </w:r>
+            <w:r>
+              <w:t>outras_atividades_sim</w:t>
+            </w:r>
+            <w:r>
+              <w:rPr>
+                <w:b/>
+                <w:bCs/>
+                <w:color w:val="000000"/>
+              </w:rPr>
+              <w:t>}</w:t>
+            </w:r>
+            <w:r>
+              <w:rPr>
+                <w:b/>
+                <w:bCs/>
+                <w:color w:val="000000"/>
+              </w:rPr>
               <w:t>) SIM</w:t>
             </w:r>
             <w:r>
@@ -7735,7 +8853,25 @@
                 <w:bCs/>
                 <w:color w:val="000000"/>
               </w:rPr>
-              <w:tab/>
+              <w:t>{</w:t>
+            </w:r>
+            <w:r>
+              <w:t>outras_atividades_nao</w:t>
+            </w:r>
+            <w:r>
+              <w:rPr>
+                <w:b/>
+                <w:bCs/>
+                <w:color w:val="000000"/>
+              </w:rPr>
+              <w:t>}</w:t>
+            </w:r>
+            <w:r>
+              <w:rPr>
+                <w:b/>
+                <w:bCs/>
+                <w:color w:val="000000"/>
+              </w:rPr>
               <w:t>) NÃO</w:t>
             </w:r>
           </w:p>
@@ -7802,7 +8938,25 @@
                 <w:bCs/>
                 <w:color w:val="000000"/>
               </w:rPr>
-              <w:tab/>
+              <w:t>{</w:t>
+            </w:r>
+            <w:r>
+              <w:t>atividade_esportes</w:t>
+            </w:r>
+            <w:r>
+              <w:rPr>
+                <w:b/>
+                <w:bCs/>
+                <w:color w:val="000000"/>
+              </w:rPr>
+              <w:t>}</w:t>
+            </w:r>
+            <w:r>
+              <w:rPr>
+                <w:b/>
+                <w:bCs/>
+                <w:color w:val="000000"/>
+              </w:rPr>
               <w:t>) ESPORTES</w:t>
             </w:r>
             <w:r>
@@ -7811,7 +8965,14 @@
                 <w:bCs/>
                 <w:color w:val="000000"/>
               </w:rPr>
-              <w:tab/>
+              <w:t xml:space="preserve">   </w:t>
+            </w:r>
+            <w:r>
+              <w:rPr>
+                <w:b/>
+                <w:bCs/>
+                <w:color w:val="000000"/>
+              </w:rPr>
               <w:t>(</w:t>
             </w:r>
             <w:r>
@@ -7820,16 +8981,68 @@
                 <w:bCs/>
                 <w:color w:val="000000"/>
               </w:rPr>
-              <w:tab/>
-              <w:t>) CULTURA (</w:t>
-            </w:r>
-            <w:r>
-              <w:rPr>
-                <w:b/>
-                <w:bCs/>
-                <w:color w:val="000000"/>
-              </w:rPr>
-              <w:tab/>
+              <w:t>{</w:t>
+            </w:r>
+            <w:r>
+              <w:t>atividade_cultura</w:t>
+            </w:r>
+            <w:r>
+              <w:rPr>
+                <w:b/>
+                <w:bCs/>
+                <w:color w:val="000000"/>
+              </w:rPr>
+              <w:t>}</w:t>
+            </w:r>
+            <w:r>
+              <w:rPr>
+                <w:b/>
+                <w:bCs/>
+                <w:color w:val="000000"/>
+              </w:rPr>
+              <w:t xml:space="preserve">) CULTURA </w:t>
+            </w:r>
+            <w:r>
+              <w:rPr>
+                <w:b/>
+                <w:bCs/>
+                <w:color w:val="000000"/>
+              </w:rPr>
+              <w:t xml:space="preserve">    </w:t>
+            </w:r>
+            <w:r>
+              <w:rPr>
+                <w:b/>
+                <w:bCs/>
+                <w:color w:val="000000"/>
+              </w:rPr>
+              <w:t>(</w:t>
+            </w:r>
+            <w:r>
+              <w:rPr>
+                <w:b/>
+                <w:bCs/>
+                <w:color w:val="000000"/>
+              </w:rPr>
+              <w:t>{</w:t>
+            </w:r>
+            <w:r>
+              <w:t>atividade_nucleo</w:t>
+            </w:r>
+            <w:r>
+              <w:rPr>
+                <w:b/>
+                <w:bCs/>
+                <w:color w:val="000000"/>
+              </w:rPr>
+              <w:t>}</w:t>
+            </w:r>
+            <w:r>
+              <w:rPr>
+                <w:b/>
+                <w:bCs/>
+                <w:color w:val="000000"/>
+              </w:rPr>
               <w:t>) NÚCLEO SOCIOEDUCATIVO</w:t>
             </w:r>
           </w:p>
@@ -7895,7 +9108,25 @@
                 <w:bCs/>
                 <w:color w:val="000000"/>
               </w:rPr>
-              <w:tab/>
+              <w:t>{</w:t>
+            </w:r>
+            <w:r>
+              <w:t>atividade_ong</w:t>
+            </w:r>
+            <w:r>
+              <w:rPr>
+                <w:b/>
+                <w:bCs/>
+                <w:color w:val="000000"/>
+              </w:rPr>
+              <w:t>}</w:t>
+            </w:r>
+            <w:r>
+              <w:rPr>
+                <w:b/>
+                <w:bCs/>
+                <w:color w:val="000000"/>
+              </w:rPr>
               <w:t>) ONG</w:t>
             </w:r>
             <w:r>
@@ -7913,7 +9144,25 @@
                 <w:bCs/>
                 <w:color w:val="000000"/>
               </w:rPr>
-              <w:tab/>
+              <w:t>{</w:t>
+            </w:r>
+            <w:r>
+              <w:t>atividade_outros</w:t>
+            </w:r>
+            <w:r>
+              <w:rPr>
+                <w:b/>
+                <w:bCs/>
+                <w:color w:val="000000"/>
+              </w:rPr>
+              <w:t>}</w:t>
+            </w:r>
+            <w:r>
+              <w:rPr>
+                <w:b/>
+                <w:bCs/>
+                <w:color w:val="000000"/>
+              </w:rPr>
               <w:t>) OUTROS. ESPECIFICAR</w:t>
             </w:r>
           </w:p>
@@ -8092,7 +9341,7 @@
     <w:tbl>
       <w:tblPr>
         <w:tblStyle w:val="ab"/>
-        <w:tblW w:w="11040" w:type="dxa"/>
+        <w:tblW w:w="10955" w:type="dxa"/>
         <w:tblInd w:w="120" w:type="dxa"/>
         <w:tblBorders>
           <w:top w:val="single" w:sz="4" w:space="0" w:color="000000"/>
@@ -8106,9 +9355,9 @@
         <w:tblLook w:val="0000" w:firstRow="0" w:lastRow="0" w:firstColumn="0" w:lastColumn="0" w:noHBand="0" w:noVBand="0"/>
       </w:tblPr>
       <w:tblGrid>
-        <w:gridCol w:w="105"/>
-        <w:gridCol w:w="10830"/>
-        <w:gridCol w:w="105"/>
+        <w:gridCol w:w="25"/>
+        <w:gridCol w:w="10905"/>
+        <w:gridCol w:w="25"/>
       </w:tblGrid>
       <w:tr>
         <w:trPr>
@@ -8116,7 +9365,7 @@
         </w:trPr>
         <w:tc>
           <w:tcPr>
-            <w:tcW w:w="10935" w:type="dxa"/>
+            <w:tcW w:w="10930" w:type="dxa"/>
             <w:gridSpan w:val="2"/>
           </w:tcPr>
           <w:p>
@@ -8174,7 +9423,25 @@
                 <w:bCs/>
                 <w:color w:val="000000"/>
               </w:rPr>
-              <w:tab/>
+              <w:t>{</w:t>
+            </w:r>
+            <w:r>
+              <w:t>servico_cras</w:t>
+            </w:r>
+            <w:r>
+              <w:rPr>
+                <w:b/>
+                <w:bCs/>
+                <w:color w:val="000000"/>
+              </w:rPr>
+              <w:t>}</w:t>
+            </w:r>
+            <w:r>
+              <w:rPr>
+                <w:b/>
+                <w:bCs/>
+                <w:color w:val="000000"/>
+              </w:rPr>
               <w:t>) CRAS  (</w:t>
             </w:r>
             <w:r>
@@ -8183,7 +9450,25 @@
                 <w:bCs/>
                 <w:color w:val="000000"/>
               </w:rPr>
-              <w:tab/>
+              <w:t>{</w:t>
+            </w:r>
+            <w:r>
+              <w:t>servico_creas</w:t>
+            </w:r>
+            <w:r>
+              <w:rPr>
+                <w:b/>
+                <w:bCs/>
+                <w:color w:val="000000"/>
+              </w:rPr>
+              <w:t>}</w:t>
+            </w:r>
+            <w:r>
+              <w:rPr>
+                <w:b/>
+                <w:bCs/>
+                <w:color w:val="000000"/>
+              </w:rPr>
               <w:t>) CREAS (</w:t>
             </w:r>
             <w:r>
@@ -8192,7 +9477,25 @@
                 <w:bCs/>
                 <w:color w:val="000000"/>
               </w:rPr>
-              <w:tab/>
+              <w:t>{</w:t>
+            </w:r>
+            <w:r>
+              <w:t>servico_creas_medidas</w:t>
+            </w:r>
+            <w:r>
+              <w:rPr>
+                <w:b/>
+                <w:bCs/>
+                <w:color w:val="000000"/>
+              </w:rPr>
+              <w:t>}</w:t>
+            </w:r>
+            <w:r>
+              <w:rPr>
+                <w:b/>
+                <w:bCs/>
+                <w:color w:val="000000"/>
+              </w:rPr>
               <w:t>)CREAS/MEDIDAS (</w:t>
             </w:r>
             <w:r>
@@ -8201,14 +9504,32 @@
                 <w:bCs/>
                 <w:color w:val="000000"/>
               </w:rPr>
-              <w:tab/>
+              <w:t>{</w:t>
+            </w:r>
+            <w:r>
+              <w:t>servico_forum</w:t>
+            </w:r>
+            <w:r>
+              <w:rPr>
+                <w:b/>
+                <w:bCs/>
+                <w:color w:val="000000"/>
+              </w:rPr>
+              <w:t>}</w:t>
+            </w:r>
+            <w:r>
+              <w:rPr>
+                <w:b/>
+                <w:bCs/>
+                <w:color w:val="000000"/>
+              </w:rPr>
               <w:t>) FÓRUM</w:t>
             </w:r>
           </w:p>
         </w:tc>
         <w:tc>
           <w:tcPr>
-            <w:tcW w:w="105" w:type="dxa"/>
+            <w:tcW w:w="25" w:type="dxa"/>
             <w:tcBorders>
               <w:top w:val="nil"/>
               <w:bottom w:val="nil"/>
@@ -8238,7 +9559,7 @@
         </w:trPr>
         <w:tc>
           <w:tcPr>
-            <w:tcW w:w="10935" w:type="dxa"/>
+            <w:tcW w:w="10930" w:type="dxa"/>
             <w:gridSpan w:val="2"/>
           </w:tcPr>
           <w:p>
@@ -8299,7 +9620,25 @@
                 <w:bCs/>
                 <w:color w:val="000000"/>
               </w:rPr>
-              <w:tab/>
+              <w:t>{</w:t>
+            </w:r>
+            <w:r>
+              <w:t>servico_conselho</w:t>
+            </w:r>
+            <w:r>
+              <w:rPr>
+                <w:b/>
+                <w:bCs/>
+                <w:color w:val="000000"/>
+              </w:rPr>
+              <w:t>}</w:t>
+            </w:r>
+            <w:r>
+              <w:rPr>
+                <w:b/>
+                <w:bCs/>
+                <w:color w:val="000000"/>
+              </w:rPr>
               <w:t>) CONSELHO TUTELAR (</w:t>
             </w:r>
             <w:r>
@@ -8308,7 +9647,25 @@
                 <w:bCs/>
                 <w:color w:val="000000"/>
               </w:rPr>
-              <w:tab/>
+              <w:t>{</w:t>
+            </w:r>
+            <w:r>
+              <w:t>servico_fundacao</w:t>
+            </w:r>
+            <w:r>
+              <w:rPr>
+                <w:b/>
+                <w:bCs/>
+                <w:color w:val="000000"/>
+              </w:rPr>
+              <w:t>}</w:t>
+            </w:r>
+            <w:r>
+              <w:rPr>
+                <w:b/>
+                <w:bCs/>
+                <w:color w:val="000000"/>
+              </w:rPr>
               <w:t>) FUNDAÇÃO CASA (</w:t>
             </w:r>
             <w:r>
@@ -8317,7 +9674,25 @@
                 <w:bCs/>
                 <w:color w:val="000000"/>
               </w:rPr>
-              <w:tab/>
+              <w:t>{</w:t>
+            </w:r>
+            <w:r>
+              <w:t>servico_centro_dia</w:t>
+            </w:r>
+            <w:r>
+              <w:rPr>
+                <w:b/>
+                <w:bCs/>
+                <w:color w:val="000000"/>
+              </w:rPr>
+              <w:t>}</w:t>
+            </w:r>
+            <w:r>
+              <w:rPr>
+                <w:b/>
+                <w:bCs/>
+                <w:color w:val="000000"/>
+              </w:rPr>
               <w:t>) CENTRO DIA</w:t>
             </w:r>
             <w:r>
@@ -8335,7 +9710,25 @@
                 <w:bCs/>
                 <w:color w:val="000000"/>
               </w:rPr>
-              <w:tab/>
+              <w:t>{</w:t>
+            </w:r>
+            <w:r>
+              <w:t>servico_saica</w:t>
+            </w:r>
+            <w:r>
+              <w:rPr>
+                <w:b/>
+                <w:bCs/>
+                <w:color w:val="000000"/>
+              </w:rPr>
+              <w:t>}</w:t>
+            </w:r>
+            <w:r>
+              <w:rPr>
+                <w:b/>
+                <w:bCs/>
+                <w:color w:val="000000"/>
+              </w:rPr>
               <w:t>) SAICA</w:t>
             </w:r>
             <w:r>
@@ -8353,14 +9746,32 @@
                 <w:bCs/>
                 <w:color w:val="000000"/>
               </w:rPr>
-              <w:tab/>
+              <w:t>{</w:t>
+            </w:r>
+            <w:r>
+              <w:t>servico_ilpi</w:t>
+            </w:r>
+            <w:r>
+              <w:rPr>
+                <w:b/>
+                <w:bCs/>
+                <w:color w:val="000000"/>
+              </w:rPr>
+              <w:t>}</w:t>
+            </w:r>
+            <w:r>
+              <w:rPr>
+                <w:b/>
+                <w:bCs/>
+                <w:color w:val="000000"/>
+              </w:rPr>
               <w:t>) ILPI</w:t>
             </w:r>
           </w:p>
         </w:tc>
         <w:tc>
           <w:tcPr>
-            <w:tcW w:w="105" w:type="dxa"/>
+            <w:tcW w:w="25" w:type="dxa"/>
             <w:tcBorders>
               <w:top w:val="nil"/>
               <w:bottom w:val="nil"/>
@@ -8390,7 +9801,7 @@
         </w:trPr>
         <w:tc>
           <w:tcPr>
-            <w:tcW w:w="10935" w:type="dxa"/>
+            <w:tcW w:w="10930" w:type="dxa"/>
             <w:gridSpan w:val="2"/>
           </w:tcPr>
           <w:p>
@@ -8450,8 +9861,96 @@
                 <w:bCs/>
                 <w:color w:val="000000"/>
               </w:rPr>
-              <w:tab/>
+              <w:t>{</w:t>
+            </w:r>
+            <w:r>
+              <w:t>servico_centro_pop</w:t>
+            </w:r>
+            <w:r>
+              <w:rPr>
+                <w:b/>
+                <w:bCs/>
+                <w:color w:val="000000"/>
+              </w:rPr>
+              <w:t>}</w:t>
+            </w:r>
+            <w:r>
+              <w:rPr>
+                <w:b/>
+                <w:bCs/>
+                <w:color w:val="000000"/>
+              </w:rPr>
               <w:t>) CENTRO POP</w:t>
+            </w:r>
+            <w:r>
+              <w:rPr>
+                <w:b/>
+                <w:bCs/>
+                <w:color w:val="000000"/>
+              </w:rPr>
+              <w:t xml:space="preserve"> </w:t>
+            </w:r>
+            <w:r>
+              <w:rPr>
+                <w:b/>
+                <w:bCs/>
+                <w:color w:val="000000"/>
+              </w:rPr>
+              <w:t>(</w:t>
+            </w:r>
+            <w:r>
+              <w:rPr>
+                <w:b/>
+                <w:bCs/>
+                <w:color w:val="000000"/>
+              </w:rPr>
+              <w:t>{</w:t>
+            </w:r>
+            <w:r>
+              <w:t>servico_seas</w:t>
+            </w:r>
+            <w:r>
+              <w:rPr>
+                <w:b/>
+                <w:bCs/>
+                <w:color w:val="000000"/>
+              </w:rPr>
+              <w:t>}</w:t>
+            </w:r>
+            <w:r>
+              <w:rPr>
+                <w:b/>
+                <w:bCs/>
+                <w:color w:val="000000"/>
+              </w:rPr>
+              <w:t>) SEAS (PETI/SITUAÇÃO DE RUA) (</w:t>
+            </w:r>
+            <w:r>
+              <w:rPr>
+                <w:b/>
+                <w:bCs/>
+                <w:color w:val="000000"/>
+              </w:rPr>
+              <w:t>{</w:t>
+            </w:r>
+            <w:r>
+              <w:t>servico_delegacia</w:t>
+            </w:r>
+            <w:r>
+              <w:rPr>
+                <w:b/>
+                <w:bCs/>
+                <w:color w:val="000000"/>
+              </w:rPr>
+              <w:t>}</w:t>
+            </w:r>
+            <w:r>
+              <w:rPr>
+                <w:b/>
+                <w:bCs/>
+                <w:color w:val="000000"/>
+              </w:rPr>
+              <w:t>) DELEGACIA</w:t>
             </w:r>
             <w:r>
               <w:rPr>
@@ -8468,41 +9967,32 @@
                 <w:bCs/>
                 <w:color w:val="000000"/>
               </w:rPr>
-              <w:tab/>
-              <w:t>) SEAS (PETI/SITUAÇÃO DE RUA) (</w:t>
-            </w:r>
-            <w:r>
-              <w:rPr>
-                <w:b/>
-                <w:bCs/>
-                <w:color w:val="000000"/>
-              </w:rPr>
-              <w:tab/>
-              <w:t>) DELEGACIA</w:t>
-            </w:r>
-            <w:r>
-              <w:rPr>
-                <w:b/>
-                <w:bCs/>
-                <w:color w:val="000000"/>
-              </w:rPr>
-              <w:tab/>
-              <w:t>(</w:t>
-            </w:r>
-            <w:r>
-              <w:rPr>
-                <w:b/>
-                <w:bCs/>
-                <w:color w:val="000000"/>
-              </w:rPr>
-              <w:tab/>
+              <w:t>{</w:t>
+            </w:r>
+            <w:r>
+              <w:t>servico_delegacia_mulher</w:t>
+            </w:r>
+            <w:r>
+              <w:rPr>
+                <w:b/>
+                <w:bCs/>
+                <w:color w:val="000000"/>
+              </w:rPr>
+              <w:t>}</w:t>
+            </w:r>
+            <w:r>
+              <w:rPr>
+                <w:b/>
+                <w:bCs/>
+                <w:color w:val="000000"/>
+              </w:rPr>
               <w:t>) DELEGACIA DA MULHER</w:t>
             </w:r>
           </w:p>
         </w:tc>
         <w:tc>
           <w:tcPr>
-            <w:tcW w:w="105" w:type="dxa"/>
+            <w:tcW w:w="25" w:type="dxa"/>
             <w:tcBorders>
               <w:top w:val="nil"/>
               <w:bottom w:val="nil"/>
@@ -8532,7 +10022,7 @@
         </w:trPr>
         <w:tc>
           <w:tcPr>
-            <w:tcW w:w="10935" w:type="dxa"/>
+            <w:tcW w:w="10930" w:type="dxa"/>
             <w:gridSpan w:val="2"/>
           </w:tcPr>
           <w:p>
@@ -8589,7 +10079,25 @@
                 <w:bCs/>
                 <w:color w:val="000000"/>
               </w:rPr>
-              <w:tab/>
+              <w:t>{</w:t>
+            </w:r>
+            <w:r>
+              <w:t>servico_centro_mulher</w:t>
+            </w:r>
+            <w:r>
+              <w:rPr>
+                <w:b/>
+                <w:bCs/>
+                <w:color w:val="000000"/>
+              </w:rPr>
+              <w:t>}</w:t>
+            </w:r>
+            <w:r>
+              <w:rPr>
+                <w:b/>
+                <w:bCs/>
+                <w:color w:val="000000"/>
+              </w:rPr>
               <w:t>) CENTRO DE REFERÊNCIA DA MULHER (</w:t>
             </w:r>
             <w:r>
@@ -8598,7 +10106,25 @@
                 <w:bCs/>
                 <w:color w:val="000000"/>
               </w:rPr>
-              <w:tab/>
+              <w:t>{</w:t>
+            </w:r>
+            <w:r>
+              <w:t>servico_pronto_socorro</w:t>
+            </w:r>
+            <w:r>
+              <w:rPr>
+                <w:b/>
+                <w:bCs/>
+                <w:color w:val="000000"/>
+              </w:rPr>
+              <w:t>}</w:t>
+            </w:r>
+            <w:r>
+              <w:rPr>
+                <w:b/>
+                <w:bCs/>
+                <w:color w:val="000000"/>
+              </w:rPr>
               <w:t>) PRONTO SOCORRO (</w:t>
             </w:r>
             <w:r>
@@ -8607,14 +10133,32 @@
                 <w:bCs/>
                 <w:color w:val="000000"/>
               </w:rPr>
-              <w:tab/>
+              <w:t>{</w:t>
+            </w:r>
+            <w:r>
+              <w:t>servico_caps</w:t>
+            </w:r>
+            <w:r>
+              <w:rPr>
+                <w:b/>
+                <w:bCs/>
+                <w:color w:val="000000"/>
+              </w:rPr>
+              <w:t>}</w:t>
+            </w:r>
+            <w:r>
+              <w:rPr>
+                <w:b/>
+                <w:bCs/>
+                <w:color w:val="000000"/>
+              </w:rPr>
               <w:t>) CAPS</w:t>
             </w:r>
           </w:p>
         </w:tc>
         <w:tc>
           <w:tcPr>
-            <w:tcW w:w="105" w:type="dxa"/>
+            <w:tcW w:w="25" w:type="dxa"/>
             <w:tcBorders>
               <w:top w:val="nil"/>
               <w:bottom w:val="nil"/>
@@ -8644,7 +10188,7 @@
         </w:trPr>
         <w:tc>
           <w:tcPr>
-            <w:tcW w:w="10935" w:type="dxa"/>
+            <w:tcW w:w="10930" w:type="dxa"/>
             <w:gridSpan w:val="2"/>
             <w:tcBorders>
               <w:bottom w:val="single" w:sz="8" w:space="0" w:color="000000"/>
@@ -8704,7 +10248,25 @@
                 <w:bCs/>
                 <w:color w:val="000000"/>
               </w:rPr>
-              <w:tab/>
+              <w:t>{</w:t>
+            </w:r>
+            <w:r>
+              <w:t>servico_sistema_prisional</w:t>
+            </w:r>
+            <w:r>
+              <w:rPr>
+                <w:b/>
+                <w:bCs/>
+                <w:color w:val="000000"/>
+              </w:rPr>
+              <w:t>}</w:t>
+            </w:r>
+            <w:r>
+              <w:rPr>
+                <w:b/>
+                <w:bCs/>
+                <w:color w:val="000000"/>
+              </w:rPr>
               <w:t>) SISTEMA PRISIONAL</w:t>
             </w:r>
             <w:r>
@@ -8722,14 +10284,32 @@
                 <w:bCs/>
                 <w:color w:val="000000"/>
               </w:rPr>
-              <w:tab/>
+              <w:t>{</w:t>
+            </w:r>
+            <w:r>
+              <w:t>servico_egresso</w:t>
+            </w:r>
+            <w:r>
+              <w:rPr>
+                <w:b/>
+                <w:bCs/>
+                <w:color w:val="000000"/>
+              </w:rPr>
+              <w:t>}</w:t>
+            </w:r>
+            <w:r>
+              <w:rPr>
+                <w:b/>
+                <w:bCs/>
+                <w:color w:val="000000"/>
+              </w:rPr>
               <w:t>) EGRESSO</w:t>
             </w:r>
           </w:p>
         </w:tc>
         <w:tc>
           <w:tcPr>
-            <w:tcW w:w="105" w:type="dxa"/>
+            <w:tcW w:w="25" w:type="dxa"/>
             <w:tcBorders>
               <w:top w:val="nil"/>
               <w:right w:val="nil"/>
@@ -8754,11 +10334,13 @@
       </w:tr>
       <w:tr>
         <w:trPr>
+          <w:gridAfter w:val="1"/>
+          <w:wAfter w:w="25" w:type="dxa"/>
           <w:trHeight w:val="348"/>
         </w:trPr>
         <w:tc>
           <w:tcPr>
-            <w:tcW w:w="105" w:type="dxa"/>
+            <w:tcW w:w="20" w:type="dxa"/>
             <w:tcBorders>
               <w:left w:val="nil"/>
               <w:bottom w:val="nil"/>
@@ -8782,8 +10364,7 @@
         </w:tc>
         <w:tc>
           <w:tcPr>
-            <w:tcW w:w="10935" w:type="dxa"/>
-            <w:gridSpan w:val="2"/>
+            <w:tcW w:w="10910" w:type="dxa"/>
             <w:tcBorders>
               <w:top w:val="single" w:sz="8" w:space="0" w:color="000000"/>
             </w:tcBorders>
@@ -8823,7 +10404,25 @@
                 <w:bCs/>
                 <w:color w:val="000000"/>
               </w:rPr>
-              <w:tab/>
+              <w:t>{</w:t>
+            </w:r>
+            <w:r>
+              <w:t>situacao_prioritaria_sim</w:t>
+            </w:r>
+            <w:r>
+              <w:rPr>
+                <w:b/>
+                <w:bCs/>
+                <w:color w:val="000000"/>
+              </w:rPr>
+              <w:t>}</w:t>
+            </w:r>
+            <w:r>
+              <w:rPr>
+                <w:b/>
+                <w:bCs/>
+                <w:color w:val="000000"/>
+              </w:rPr>
               <w:t>) SIM  (</w:t>
             </w:r>
             <w:r>
@@ -8832,7 +10431,25 @@
                 <w:bCs/>
                 <w:color w:val="000000"/>
               </w:rPr>
-              <w:tab/>
+              <w:t>{</w:t>
+            </w:r>
+            <w:r>
+              <w:t>situacao_prioritaria_nao</w:t>
+            </w:r>
+            <w:r>
+              <w:rPr>
+                <w:b/>
+                <w:bCs/>
+                <w:color w:val="000000"/>
+              </w:rPr>
+              <w:t>}</w:t>
+            </w:r>
+            <w:r>
+              <w:rPr>
+                <w:b/>
+                <w:bCs/>
+                <w:color w:val="000000"/>
+              </w:rPr>
               <w:t>) NÃO. CÓDIGO</w:t>
             </w:r>
           </w:p>
@@ -8859,6 +10476,7 @@
           <w:szCs w:val="16"/>
         </w:rPr>
       </w:pPr>
+      <w:bookmarkStart w:id="0" w:name="_GoBack"/>
     </w:p>
     <w:tbl>
       <w:tblPr>
@@ -8887,6 +10505,7 @@
           <w:tcPr>
             <w:tcW w:w="10939" w:type="dxa"/>
           </w:tcPr>
+          <w:bookmarkEnd w:id="0"/>
           <w:p>
             <w:pPr>
               <w:pBdr>
@@ -9051,7 +10670,7 @@
               </wp:anchor>
             </w:drawing>
           </mc:Choice>
-          <mc:Fallback xmlns:sl="http://schemas.openxmlformats.org/schemaLibrary/2006/main" xmlns:a="http://schemas.openxmlformats.org/drawingml/2006/main" xmlns:pic="http://schemas.openxmlformats.org/drawingml/2006/picture" xmlns:c="http://schemas.openxmlformats.org/drawingml/2006/chart" xmlns:lc="http://schemas.openxmlformats.org/drawingml/2006/lockedCanvas" xmlns:dgm="http://schemas.openxmlformats.org/drawingml/2006/diagram" xmlns="http://schemas.microsoft.com/office/tasks/2019/documenttasks" xmlns:cr="http://schemas.microsoft.com/office/comments/2020/reactions">
+          <mc:Fallback xmlns:cr="http://schemas.microsoft.com/office/comments/2020/reactions" xmlns="http://schemas.microsoft.com/office/tasks/2019/documenttasks" xmlns:dgm="http://schemas.openxmlformats.org/drawingml/2006/diagram" xmlns:lc="http://schemas.openxmlformats.org/drawingml/2006/lockedCanvas" xmlns:c="http://schemas.openxmlformats.org/drawingml/2006/chart" xmlns:pic="http://schemas.openxmlformats.org/drawingml/2006/picture" xmlns:a="http://schemas.openxmlformats.org/drawingml/2006/main" xmlns:sl="http://schemas.openxmlformats.org/schemaLibrary/2006/main">
             <w:drawing>
               <wp:anchor allowOverlap="1" behindDoc="0" distB="0" distT="0" distL="0" distR="0" hidden="0" layoutInCell="1" locked="0" relativeHeight="0" simplePos="0">
                 <wp:simplePos x="0" y="0"/>
@@ -9161,7 +10780,7 @@
               </wp:anchor>
             </w:drawing>
           </mc:Choice>
-          <mc:Fallback xmlns:sl="http://schemas.openxmlformats.org/schemaLibrary/2006/main" xmlns:a="http://schemas.openxmlformats.org/drawingml/2006/main" xmlns:pic="http://schemas.openxmlformats.org/drawingml/2006/picture" xmlns:c="http://schemas.openxmlformats.org/drawingml/2006/chart" xmlns:lc="http://schemas.openxmlformats.org/drawingml/2006/lockedCanvas" xmlns:dgm="http://schemas.openxmlformats.org/drawingml/2006/diagram" xmlns="http://schemas.microsoft.com/office/tasks/2019/documenttasks" xmlns:cr="http://schemas.microsoft.com/office/comments/2020/reactions">
+          <mc:Fallback xmlns:cr="http://schemas.microsoft.com/office/comments/2020/reactions" xmlns="http://schemas.microsoft.com/office/tasks/2019/documenttasks" xmlns:dgm="http://schemas.openxmlformats.org/drawingml/2006/diagram" xmlns:lc="http://schemas.openxmlformats.org/drawingml/2006/lockedCanvas" xmlns:c="http://schemas.openxmlformats.org/drawingml/2006/chart" xmlns:pic="http://schemas.openxmlformats.org/drawingml/2006/picture" xmlns:a="http://schemas.openxmlformats.org/drawingml/2006/main" xmlns:sl="http://schemas.openxmlformats.org/schemaLibrary/2006/main">
             <w:drawing>
               <wp:anchor allowOverlap="1" behindDoc="0" distB="0" distT="0" distL="0" distR="0" hidden="0" layoutInCell="1" locked="0" relativeHeight="0" simplePos="0">
                 <wp:simplePos x="0" y="0"/>

</xml_diff>